<commit_message>
chore: update student details to Mohini Deshmukh (PRN: 2425010071, Roll No: DS(76)) across docx, reports, and screenshots
</commit_message>
<xml_diff>
--- a/Theory-ISE2-MLFlow Data Analysis.docx
+++ b/Theory-ISE2-MLFlow Data Analysis.docx
@@ -207,7 +207,7 @@
                 <w:color w:val="262626"/>
                 <w:sz w:val="19"/>
               </w:rPr>
-              <w:t>Aditi Rewadkar</w:t>
+              <w:t>Mohini Deshmukh</w:t>
             </w:r>
           </w:p>
         </w:tc>
@@ -278,7 +278,7 @@
                 <w:color w:val="262626"/>
                 <w:sz w:val="19"/>
               </w:rPr>
-              <w:t>2425010132  (Roll No: DS75)</w:t>
+              <w:t>2425010071  (Roll No: DS(76))</w:t>
             </w:r>
           </w:p>
         </w:tc>
@@ -640,7 +640,7 @@
       <w:r>
         <w:drawing>
           <wp:inline>
-            <wp:extent cx="5669280" cy="7462834"/>
+            <wp:extent cx="5669280" cy="7586527"/>
             <wp:docPr id="1" name="Picture 1"/>
             <wp:cNvGraphicFramePr>
               <a:graphicFrameLocks noChangeAspect="1"/>
@@ -661,7 +661,7 @@
                   <pic:spPr>
                     <a:xfrm>
                       <a:off x="0" y="0"/>
-                      <a:ext cx="5669280" cy="7462834"/>
+                      <a:ext cx="5669280" cy="7586527"/>
                     </a:xfrm>
                     <a:prstGeom prst="rect"/>
                   </pic:spPr>
@@ -1200,7 +1200,7 @@
       <w:r>
         <w:drawing>
           <wp:inline>
-            <wp:extent cx="5669280" cy="3590544"/>
+            <wp:extent cx="5669280" cy="3779520"/>
             <wp:docPr id="2" name="Picture 2"/>
             <wp:cNvGraphicFramePr>
               <a:graphicFrameLocks noChangeAspect="1"/>
@@ -1221,7 +1221,7 @@
                   <pic:spPr>
                     <a:xfrm>
                       <a:off x="0" y="0"/>
-                      <a:ext cx="5669280" cy="3590544"/>
+                      <a:ext cx="5669280" cy="3779520"/>
                     </a:xfrm>
                     <a:prstGeom prst="rect"/>
                   </pic:spPr>
@@ -1301,7 +1301,7 @@
           <w:color w:val="2F5597"/>
           <w:sz w:val="19"/>
         </w:rPr>
-        <w:t>Figure 1.3: Live MLflow Run Details for Model_Training_And_Evaluation with Student Tags (Aditi Rewadkar)</w:t>
+        <w:t>Figure 1.3: Live MLflow Run Details for Model_Training_And_Evaluation with Student Tags (Mohini Deshmukh)</w:t>
       </w:r>
     </w:p>
     <w:p>
@@ -3208,7 +3208,7 @@
       <w:r>
         <w:drawing>
           <wp:inline>
-            <wp:extent cx="5669280" cy="2279647"/>
+            <wp:extent cx="5669280" cy="2422871"/>
             <wp:docPr id="9" name="Picture 9"/>
             <wp:cNvGraphicFramePr>
               <a:graphicFrameLocks noChangeAspect="1"/>
@@ -3229,7 +3229,7 @@
                   <pic:spPr>
                     <a:xfrm>
                       <a:off x="0" y="0"/>
-                      <a:ext cx="5669280" cy="2279647"/>
+                      <a:ext cx="5669280" cy="2422871"/>
                     </a:xfrm>
                     <a:prstGeom prst="rect"/>
                   </pic:spPr>

</xml_diff>

<commit_message>
chore: update student details to Shivam Korpade (PRN: 2324000756, Roll No: DS38) across code, docx, reports, and screenshots
</commit_message>
<xml_diff>
--- a/Theory-ISE2-MLFlow Data Analysis.docx
+++ b/Theory-ISE2-MLFlow Data Analysis.docx
@@ -207,7 +207,7 @@
                 <w:color w:val="262626"/>
                 <w:sz w:val="19"/>
               </w:rPr>
-              <w:t>Mohini Deshmukh</w:t>
+              <w:t>Shivam Korpade</w:t>
             </w:r>
           </w:p>
         </w:tc>
@@ -278,7 +278,7 @@
                 <w:color w:val="262626"/>
                 <w:sz w:val="19"/>
               </w:rPr>
-              <w:t>2425010071  (Roll No: DS(76))</w:t>
+              <w:t>2324000756  (Roll No: DS38)</w:t>
             </w:r>
           </w:p>
         </w:tc>
@@ -1301,7 +1301,7 @@
           <w:color w:val="2F5597"/>
           <w:sz w:val="19"/>
         </w:rPr>
-        <w:t>Figure 1.3: Live MLflow Run Details for Model_Training_And_Evaluation with Student Tags (Mohini Deshmukh)</w:t>
+        <w:t>Figure 1.3: Live MLflow Run Details for Model_Training_And_Evaluation with Student Tags (Shivam Korpade)</w:t>
       </w:r>
     </w:p>
     <w:p>

</xml_diff>